<commit_message>
v4.29 (11/n) — D7 disable "View in Production" button + Costing UAT retry-pill step
D7 (P2): the planning slot-detail "View job in production" button navigated to the still-mocked
Production Dashboard. Relabelled "View in Production (coming soon)", disabled + greyed
(cursor-not-allowed opacity-50), version-neutral tooltip; onClick prop kept but inert. Applied to both
SlotDetail (mock) + LiveSlotDetail (live); added data-testid="view-in-production" + "slot-cell".
Journey test_planning_view_in_production_disabled_d7 opens a slot and asserts the button is disabled
(planning journey 4/4 green). §3.7: added step 5.5 (retry-pill) to the Costing UAT script.

WO §0.4/§3.4 + the as-shipped block (business-process folder, outside this repo) were reconciled to the
implemented within-week-guard rule per your decision.

Co-Authored-By: Claude Opus 4.8 <noreply@anthropic.com>
</commit_message>
<xml_diff>
--- a/docs/uat/ICB_MES_UAT_Script_Costing_v1.0.docx
+++ b/docs/uat/ICB_MES_UAT_Script_Costing_v1.0.docx
@@ -630,6 +630,14 @@
       </w:r>
     </w:p>
     <w:p>
+      <w:r>
+        <w:rPr>
+          <w:i w:val="0"/>
+        </w:rPr>
+        <w:t>☐  5.5.  (WO v4.29 retry pill) If a costing shows “Accepted” but its production job was not created (an amber “job pending” badge, with a “Retry job creation” pill in the Actions column), click “Retry job creation”. The production job is created (HTTP 201), the pill disappears, and the row moves to the with-job state. Previously this button did nothing — confirm it now works.</w:t>
+      </w:r>
+    </w:p>
+    <w:p>
       <w:pPr>
         <w:pStyle w:val="Heading2"/>
       </w:pPr>

</xml_diff>